<commit_message>
docs(framework): log the missing-English-language-directive bug in §6.4
</commit_message>
<xml_diff>
--- a/docs/framework/Apex-Implementation-Report.docx
+++ b/docs/framework/Apex-Implementation-Report.docx
@@ -1378,6 +1378,14 @@
       </w:pPr>
       <w:r>
         <w:t>Spec-drift revived on functional-spec.md only, deliberately not on technical-spec.md (2026-09-01). The 2026-07-11 removal above was never fully closed — amend_locked_spec (the audit-trail function the removed UI flag used to call) kept the same coarse "every story at or past this file's lock phase" attribution, just no longer surfaced as a blocking flag, so amendments.md kept logging over-broad affected-story lists for every post-lock edit. The fix is scoped to the one dimension spec-index.json actually tracks precisely: each @SC-n Gherkin scenario already carries an exact owning story_id (parse_gherkin_scenario_ids), unlike technical-spec.md's endpoint/entity ids, which have no per-story ownership anywhere in the system — that's a structural gap, not an oversight, since technical-spec.md is deliberately written as one project-wide unified contract (write_project_technical_spec) rather than per-story sections. amend_locked_spec now accepts old_content and, only for functional-spec.md, diffs the pre-edit scenario set against the post-edit one to narrow affected_story_ids to the stories whose own scenario actually changed; anything the diff can't attribute to a tagged scenario (a heading, a story description) falls back to the original full set rather than under-reporting. The two write paths that overwrite functional-spec.md with old content still available to capture — the sidebar context-file editor and the Taiga Wiki / Plane Pages pull route — were updated to supply it.</w:t>
+      </w:r>
+    </w:p>
+    <w:p>
+      <w:pPr>
+        <w:pStyle w:val="ListBullet"/>
+      </w:pPr>
+      <w:r>
+        <w:t>English generation had no language directive at all, only Portuguese did (found 2026-09-08). _LANGUAGE_DIRECTIVES was pt-only; .get(get_ai_language(), "") meant the default English case injected no language instruction whatsoever into the system prompt, so nothing told the model to hold English when the fenced &lt;user_content&gt; below (a project concept, a PM description, an older spec file) was written in Portuguese -- generation was free to mirror whichever language dominated the input. Not a Portuguese-specific bug: an English-has-no-override bug, reported as "the system randomly starts talking Portuguese". Both directives now state explicitly that the target language wins over the input's language and instruct translating foreign-language input rather than echoing or drifting into it; the lookup falls back to the English directive for any unrecognized language code instead of silence.</w:t>
       </w:r>
     </w:p>
     <w:p>

</xml_diff>

<commit_message>
docs(framework): log Fix-Bolt manual-creation gap in Implementation Report
New $2.8 - found via real dogfooding (Outfolio's own Phase 3/4 work
for the thesis demonstration), not a defect in the governance
mechanism: fail_gate already supported a scenario-free manual bug
report, the gap was frontend-only.
</commit_message>
<xml_diff>
--- a/docs/framework/Apex-Implementation-Report.docx
+++ b/docs/framework/Apex-Implementation-Report.docx
@@ -424,6 +424,20 @@
       <w:pPr/>
       <w:r>
         <w:t>Context Traceability Rate moved from artifact-presence to chain-resolution (2026-09-01). It already existed (AnalyticsService.summary's traceability block, commit 0846784, 2026-06-12) computing a real aggregate rate, but "complete" only meant every artifact file was present (has_gherkin, has_bdd, has_infra_delta, a deployment-log entry, a complete verification matrix), not that the chain still resolved. A story could show every box checked while Phase 6 had already flagged it broken: an unresolved trace_flag (a downstream failure pointed back at an earlier phase and never acknowledged) or an unacknowledged conformance_regressed (a later code change broke what used to match the locked spec) — both existing Phase 6 signals, previously not consulted by this metric, so the traceability rate and the risk-score column could silently disagree about the same story. AnalyticsService._chain_resolved (renamed from _artifact_complete; the per-story field is now chain_resolved, not artifact_complete, in the schema and the CSV/Markdown export) adds both as hard gates. The third leg of the proposal's own definition — "resolves back to... the Unit of Work that motivated it" — needed no new check: every story-index entry is keyed by the PM tool's own story id already, so that leg resolves by construction. What this does not attempt: per-endpoint/entity attribution of a deployed story back to specific technical-spec.md bullets — that ownership doesn't exist anywhere in the system, the same gap as the spec-drift entry in §6.4, and fabricating it here would spend the same mistake on a different metric.</w:t>
+      </w:r>
+    </w:p>
+    <w:p>
+      <w:pPr>
+        <w:pStyle w:val="Heading2"/>
+      </w:pPr>
+      <w:r>
+        <w:t>2.8 Fix-Bolt creation: a manual path was missing</w:t>
+      </w:r>
+    </w:p>
+    <w:p>
+      <w:pPr/>
+      <w:r>
+        <w:t>Every Fix-Bolt, until 2026-09-18, could only be created through Phase 4’s QA-fail wizard (generate-bug-report → save-bug-report → fail-gate), which requires at least one failed scenario result to reach. Found during Outfolio’s own Phase 3-4 work for the thesis demonstration: real defects were caught by manual end-to-end testing, outside any scripted QA run, and there was no way to log them as a Fix-Bolt at all -- only as a plain note. The backend already supported this without change: Phase4Service.fail_gate’s scenario_results parameter is optional and the endpoint carries no phase_status restriction, so it already saves the bug report, increments fix_bolt_count, and appends the permanent Fix Log independently of any QA run -- the gap was frontend-only, no UI ever called it that way. Added a “Report Bug” form to the Fix-Bolt dashboard: it lists every story via the existing analytics summary (not the Phase-4-only eligible-stories list, which is restricted to implementation/qa status and would have excluded stories already past that point), and submitting calls fail-gate directly with the story id, the bug report text, and an optional root cause and resolution summary. This is a workflow-completeness gap found through real dogfooding, not a defect in the governance mechanism itself: the AI Defect Escape Rate and Fix-Bolt bookkeeping in §2.7 already handled a manually-created Fix-Bolt identically to a QA-triggered one once fail-gate is called.</w:t>
       </w:r>
     </w:p>
     <w:p>

</xml_diff>

<commit_message>
docs(framework): log the two Fix-Bolt bugs found right after S2.8 shipped
Data loss (fail_gate overwrote a story's existing bug report) and an
incomplete per-story record (root cause/resolution only ever reached
the separate Fix Log). Both found live, both fixed same-day.
</commit_message>
<xml_diff>
--- a/docs/framework/Apex-Implementation-Report.docx
+++ b/docs/framework/Apex-Implementation-Report.docx
@@ -438,6 +438,12 @@
       <w:pPr/>
       <w:r>
         <w:t>Every Fix-Bolt, until 2026-09-18, could only be created through Phase 4’s QA-fail wizard (generate-bug-report → save-bug-report → fail-gate), which requires at least one failed scenario result to reach. Found during Outfolio’s own Phase 3-4 work for the thesis demonstration: real defects were caught by manual end-to-end testing, outside any scripted QA run, and there was no way to log them as a Fix-Bolt at all -- only as a plain note. The backend already supported this without change: Phase4Service.fail_gate’s scenario_results parameter is optional and the endpoint carries no phase_status restriction, so it already saves the bug report, increments fix_bolt_count, and appends the permanent Fix Log independently of any QA run -- the gap was frontend-only, no UI ever called it that way. Added a “Report Bug” form to the Fix-Bolt dashboard: it lists every story via the existing analytics summary (not the Phase-4-only eligible-stories list, which is restricted to implementation/qa status and would have excluded stories already past that point), and submitting calls fail-gate directly with the story id, the bug report text, and an optional root cause and resolution summary. This is a workflow-completeness gap found through real dogfooding, not a defect in the governance mechanism itself: the AI Defect Escape Rate and Fix-Bolt bookkeeping in §2.7 already handled a manually-created Fix-Bolt identically to a QA-triggered one once fail-gate is called.</w:t>
+      </w:r>
+    </w:p>
+    <w:p>
+      <w:pPr/>
+      <w:r>
+        <w:t>Using the new manual path immediately surfaced two more real bugs in the mechanism it exposed, both fixed same-day. First, a data-loss bug: fail_gate called save_bug_report unconditionally, and save_bug_report is a plain overwrite -- one file per story, no history. Logging a second Fix-Bolt against a story that already had one silently destroyed the first, with no way to recover it; Tomas hit this directly while reporting a real Outfolio defect against a story with an existing entry and lost the original content. fail_gate now loads any existing bug report first and, if one exists, appends the new entry under a dated, numbered "## Fix-Bolt #N" heading instead of replacing it. Second, an incomplete-record bug: root_cause and resolution_summary were written only to the separate, global Fix Log, never to the per-story bug report itself, so filling in every field of the manual form and then opening that story’s own Bug Report showed only the description, with no trace of the root cause or resolution just entered. Both fields are now folded into the saved per-story artefact as well. A regression test covers the exact reported scenario (two Fix-Bolts on one story, both must survive); the existing fail_gate test was updated for the new, correct single-artefact-shows-everything behaviour.</w:t>
       </w:r>
     </w:p>
     <w:p>

</xml_diff>

<commit_message>
docs(framework): log the Spec Drift 0/100 bug and the grid overflow bug
Both found live via Outfolio, both real: a wrong-heading check silently
blanked every real GitHub sync (S6.6), and a bare CSS grid 1fr track
overflowed the page on long endpoint-contract text (S6.5).
</commit_message>
<xml_diff>
--- a/docs/framework/Apex-Implementation-Report.docx
+++ b/docs/framework/Apex-Implementation-Report.docx
@@ -1480,6 +1480,14 @@
     </w:p>
     <w:p>
       <w:pPr>
+        <w:pStyle w:val="ListBullet"/>
+      </w:pPr>
+      <w:r>
+        <w:t>A CSS grid “1fr” track does not shrink below its content's intrinsic width (found 2026-09-18). The Spec Drift page's two-column layout (story list + report panel) used a bare grid-cols-[16rem_1fr]; the endpoint-contract table's long, largely unbroken signature strings forced the report-panel column wider than the viewport instead of wrapping, bleeding page content past the right edge with no scrollbar to reach it. Fixed with minmax(0,1fr) on the track (the standard fix for this exact grid/flexbox min-width:auto gotcha), the endpoint table's own wrapper made to scroll horizontally instead of clipping, and break-words added to the long text cells so wrapping is the common case rather than needing to scroll at all.</w:t>
+      </w:r>
+    </w:p>
+    <w:p>
+      <w:pPr>
         <w:pStyle w:val="Heading2"/>
         <w:rPr/>
       </w:pPr>
@@ -1668,6 +1676,14 @@
       </w:pPr>
       <w:r>
         <w:t>Self-hosted Plane Community Edition has no Pages REST endpoint at all (confirmed 2026-08-19 by direct probe: GET .../pages/ 404s while modules/, issues/, and the project-detail endpoint on the identical project all return 200 — ruling out a wrong id or URL). Unlike Epics, which CE still exposes but gates to 404, Pages appears entirely absent from CE's API surface — a genuine, permanent Plane limitation, not an Apex bug. _list_pages now treats that 404 as "no pages" instead of raising, so the sidebar degrades to an empty list instead of a 502 on every project load; publish() still fails loudly if explicitly tried against CE, since no create-fallback exists to degrade to.</w:t>
+      </w:r>
+    </w:p>
+    <w:p>
+      <w:pPr>
+        <w:pStyle w:val="ListBullet"/>
+      </w:pPr>
+      <w:r>
+        <w:t>Code conformance scored 0/100 on every project with real, synced code, for as long as the feature has existed (found 2026-09-18, while using Outfolio - the code was real and confirmed present, but every verification run reported “no source code or test files were provided.”). The check that decides whether github-context.md holds a real sync or just the unpopulated template looked for the literal string “## File Tree” - a string that has never appeared in real repomix output. github_fetch.clone_and_pack (§2.4) writes repomix's own --style markdown output verbatim, with no wrapper; running the pinned repomix CLI directly confirms its real heading is “# Directory Structure”. “## File Tree” only ever existed in this project's own placeholder-template comment text, describing what a sync would contain rather than naming an actual heading, and in test fixtures that copied the same wrong assumption rather than exercising real repomix output. Every real GitHub sync was therefore silently treated as unsynced by this one check, at the exact point the conformance service decides what to hand the AI verifier - which then correctly, and misleadingly, reported no code to check. Fixed to check for “# Directory Structure” instead; a regression test now asserts real repomix-shaped content is not blanked, closing a coverage gap where no existing test actually inspected what content this check let through, only whether a score was returned.</w:t>
       </w:r>
     </w:p>
     <w:p>

</xml_diff>

<commit_message>
docs(framework): log the Testing-gate loop-back and QA-results-unreadable bugs
Both found live via Outfolio, both real: fail_gate never routed a
failed story back to Implementation (S6.4), and prior QA attempt
history was saved but had no read path anywhere (S6.4).
</commit_message>
<xml_diff>
--- a/docs/framework/Apex-Implementation-Report.docx
+++ b/docs/framework/Apex-Implementation-Report.docx
@@ -1406,6 +1406,22 @@
       </w:pPr>
       <w:r>
         <w:t>English generation had no language directive at all, only Portuguese did (found 2026-09-08). _LANGUAGE_DIRECTIVES was pt-only; .get(get_ai_language(), "") meant the default English case injected no language instruction whatsoever into the system prompt, so nothing told the model to hold English when the fenced &lt;user_content&gt; below (a project concept, a PM description, an older spec file) was written in Portuguese -- generation was free to mirror whichever language dominated the input. Not a Portuguese-specific bug: an English-has-no-override bug, reported as "the system randomly starts talking Portuguese". Both directives now state explicitly that the target language wins over the input's language and instruct translating foreign-language input rather than echoing or drifting into it; the lookup falls back to the English directive for any unrecognized language code instead of silence.</w:t>
+      </w:r>
+    </w:p>
+    <w:p>
+      <w:pPr>
+        <w:pStyle w:val="ListBullet"/>
+      </w:pPr>
+      <w:r>
+        <w:t>A failed Testing gate never routed the story back to Implementation (found 2026-09-19, on Outfolio: a failed story showed no Fix-Bolt/Regression Bypass tag and no record of which scenario had failed when the user returned to pick a story to test). pass_gate sets phase_status=“qa_passed”; fail_gate set nothing, so a failing story stayed at “qa” indefinitely with a bug report attached. is_regression_bypass, and the matching Analytics risk-score contribution, both key on has_bug_report AND phase_status==“implementation” - a condition that could never become true through this gate, since nothing performed that transition. The framework's own “a failed gate routes back to a named phase” rule was simply never implemented for this one gate, even though the equivalent Phase 6 Secure Lane path already did it correctly for post-deployment issues. Fixed by having fail_gate set phase_status=“implementation”, the same value the Secure Lane path uses. An existing test's own docstring had asserted “no phase_status downgrade” as the intended design; it wasn't actually asserted by the test body, and it directly contradicted the badge condition sitting right next to it.</w:t>
+      </w:r>
+    </w:p>
+    <w:p>
+      <w:pPr>
+        <w:pStyle w:val="ListBullet"/>
+      </w:pPr>
+      <w:r>
+        <w:t>Prior QA results were saved but never readable (found 2026-09-19, same report as the bullet above). save_qa_results has always persisted a per-story pass/fail attempt history, but no API route ever exposed it and no frontend code ever fetched it - the client-side store tracking which scenario failed was populated only by a live fail-gate event in the same browser session, so a fresh session, a different device, or picking a different story in between showed nothing, even though the server had the answer the whole time. Added a read route and a hook that hydrates the store from the server's last attempt when a story's Testing stage loads, mirroring the pattern already used to load a saved test plan the same way.</w:t>
       </w:r>
     </w:p>
     <w:p>

</xml_diff>

<commit_message>
docs(framework): log the Next.js App Router route-detection gap in S6.4
</commit_message>
<xml_diff>
--- a/docs/framework/Apex-Implementation-Report.docx
+++ b/docs/framework/Apex-Implementation-Report.docx
@@ -1422,6 +1422,14 @@
       </w:pPr>
       <w:r>
         <w:t>Prior QA results were saved but never readable (found 2026-09-19, same report as the bullet above). save_qa_results has always persisted a per-story pass/fail attempt history, but no API route ever exposed it and no frontend code ever fetched it - the client-side store tracking which scenario failed was populated only by a live fail-gate event in the same browser session, so a fresh session, a different device, or picking a different story in between showed nothing, even though the server had the answer the whole time. Added a read route and a hook that hydrates the store from the server's last attempt when a story's Testing stage loads, mirroring the pattern already used to load a saved test plan the same way.</w:t>
+      </w:r>
+    </w:p>
+    <w:p>
+      <w:pPr>
+        <w:pStyle w:val="ListBullet"/>
+      </w:pPr>
+      <w:r>
+        <w:t>Layer A's deterministic route-detector could not see Next.js App Router endpoints at all (found 2026-09-19, on Outfolio - Next.js App Router throughout). Every existing pattern matched a call-style route declaration (app.post(“/x”), @Get(“/x”)) somewhere in a file's text; App Router has no such call, since a route's URL comes from the file's own location (app/api/projects/route.ts) and its methods from that file's own named exports (export async function GET(...)). Every real endpoint in a Next.js App Router project therefore read “missing” on Quick Check regardless of how much real code was synced, once the populated-check bug above stopped blanking the context that would otherwise have reached it. Added a dedicated extractor that reads a route file's own path (stripping the route.ts suffix and any route-group segments, which Next.js drops from the URL entirely) and its own named exports, and extended the path-parameter normaliser to collapse Next.js dynamic segments ([id], [...slug]) the same way it already collapses {id}/&lt;id&gt;/:id, so a spec written with {id} still matches code written with [id].</w:t>
       </w:r>
     </w:p>
     <w:p>

</xml_diff>

<commit_message>
docs(framework): log the missing story-context invalidation bug in §6.5
</commit_message>
<xml_diff>
--- a/docs/framework/Apex-Implementation-Report.docx
+++ b/docs/framework/Apex-Implementation-Report.docx
@@ -1516,6 +1516,25 @@
       </w:pPr>
       <w:r>
         <w:t>A CSS grid “1fr” track does not shrink below its content's intrinsic width (found 2026-09-18). The Spec Drift page's two-column layout (story list + report panel) used a bare grid-cols-[16rem_1fr]; the endpoint-contract table's long, largely unbroken signature strings forced the report-panel column wider than the viewport instead of wrapping, bleeding page content past the right edge with no scrollbar to reach it. Fixed with minmax(0,1fr) on the track (the standard fix for this exact grid/flexbox min-width:auto gotcha), the endpoint table's own wrapper made to scroll horizontally instead of clipping, and break-words added to the long text cells so wrapping is the common case rather than needing to scroll at all.</w:t>
+      </w:r>
+    </w:p>
+    <w:p>
+      <w:pPr>
+        <w:pStyle w:val="ListBullet"/>
+        <w:numPr>
+          <w:ilvl w:val="0"/>
+          <w:numId w:val="1"/>
+        </w:numPr>
+        <w:rPr/>
+      </w:pPr>
+      <w:r>
+        <w:rPr>
+          <w:b/>
+        </w:rPr>
+        <w:t>GitHub Actions deployment completion never told the frontend to look again (2026-09-19). Dispatching or syncing a GitHub Actions deployment run correctly marked a story deployed server-side, and StageD's terminal screen correctly branched on ctx.deployed from the phase5/story-context query - but neither useDispatchGithubDeployment nor useSyncGithubDeployment ever invalidated that query. React Query has no reason to refetch without an explicit invalidateQueries call, so the cached pre-deploy context never updated: a user who clicked "Sync run" after a real deployment saw the success banner and a toast confirming the sync, but stayed stuck on the input form indefinitely. Found live via dogfooding on OutfolioV1's actual GitHub Actions pipeline, immediately after the prior dispatch-race/terminal-screen fix above had already been verified and shipped - the earlier verification only exercised StageD's render logic against a static mock, not the real mutation-triggered invalidation flow. Fixed by adding the missing invalidateQueries call to both mutations' onSuccess, plus a regression test that clicks through the real flow instead of asserting render logic alone.</w:t>
+      </w:r>
+      <w:r>
+        <w:rPr/>
       </w:r>
     </w:p>
     <w:p>

</xml_diff>

<commit_message>
docs(framework): log the deployment-log viewer feature in §2.9
</commit_message>
<xml_diff>
--- a/docs/framework/Apex-Implementation-Report.docx
+++ b/docs/framework/Apex-Implementation-Report.docx
@@ -70,7 +70,7 @@
           <w:b w:val="false"/>
           <w:i w:val="false"/>
         </w:rPr>
-        <w:t>Interview feedback on Apex's academic presentation asked for real engineering documentation — implementation, testing, and deployment — beyond the product-facing README. This document is that record. It describes Apex as of this writing: a split-stack web application with 1,606 backend tests (1,605 passing; one pre-existing, unrelated failure — see §5), 305 frontend unit tests, and 24 end-to-end Playwright test cases across 12 spec files.</w:t>
+        <w:t>Interview feedback on Apex's academic presentation asked for real engineering documentation — implementation, testing, and deployment — beyond the product-facing README. This document is that record. It describes Apex as of this writing: a split-stack web application with 1,638 backend tests (1,637 passing; one pre-existing, unrelated failure — see §5), 318 frontend unit tests, and 24 end-to-end Playwright test cases across 12 spec files.</w:t>
       </w:r>
     </w:p>
     <w:p>
@@ -448,6 +448,20 @@
     </w:p>
     <w:p>
       <w:pPr>
+        <w:pStyle w:val="Heading2"/>
+      </w:pPr>
+      <w:r>
+        <w:t>2.9 Deployment log: a written context file with no viewer anywhere</w:t>
+      </w:r>
+    </w:p>
+    <w:p>
+      <w:pPr/>
+      <w:r>
+        <w:t>deployment-log.md is an append-only audit trail Phase5Service has always written on every manual gate pass and every GitHub Actions dispatch/sync (found 2026-09-20, immediately after the story-context invalidation fix in S6.5 above), but it was never listed in the generic context-files response and had no viewer anywhere in the UI - it is a log, not an editable spec artefact, so it deliberately carries none of the lock, version or wiki-sync semantics the other context files do, and had simply been left off the Active Context surface as a result. Fixed by adding a dedicated read-only GET /api/workspace/deployment-log route and a "View Deployment Log" button in the Phase 5 header, opening a modal that renders the log as markdown with download and copy actions, matching the existing deploy pack viewer. 2 new backend tests; full backend suite 1639/1640 (the one known pre-existing unrelated failure), frontend typecheck/lint/vitest all clean.</w:t>
+      </w:r>
+    </w:p>
+    <w:p>
+      <w:pPr>
         <w:pStyle w:val="Heading1"/>
         <w:rPr/>
       </w:pPr>
@@ -493,7 +507,7 @@
           <w:b w:val="false"/>
           <w:i w:val="false"/>
         </w:rPr>
-        <w:t>1,606 tests as of this writing (python -m pytest tests/ -v --tb=short; 1,605 passing, one pre-existing failure unrelated to any work in this document — see §5), gated in CI before any Docker build is even attempted. Six autouse fixtures in tests/conftest.py remove entire categories of flaky-test risk by construction rather than by convention:</w:t>
+        <w:t>1,638 tests as of this writing (python -m pytest tests/ -v --tb=short; 1,637 passing, one pre-existing failure unrelated to any work in this document — see §5), gated in CI before any Docker build is even attempted. Six autouse fixtures in tests/conftest.py remove entire categories of flaky-test risk by construction rather than by convention:</w:t>
       </w:r>
     </w:p>
     <w:p>
@@ -627,7 +641,7 @@
           <w:b w:val="false"/>
           <w:i w:val="false"/>
         </w:rPr>
-        <w:t>305 unit tests (Vitest) cover hooks, pure utility functions, and component rendering. 24 end-to-end test cases (Playwright, Chromium) across 12 spec files exercise one full phase flow each against mocked backend and Taiga APIs — critically, the mocking happens at the Chromium network layer (page.route()), not by swapping out</w:t>
+        <w:t>318 unit tests (Vitest) cover hooks, pure utility functions, and component rendering. 24 end-to-end test cases (Playwright, Chromium) across 12 spec files exercise one full phase flow each against mocked backend and Taiga APIs — critically, the mocking happens at the Chromium network layer (page.route()), not by swapping out</w:t>
       </w:r>
     </w:p>
     <w:p>
@@ -883,7 +897,7 @@
       </w:pPr>
       <w:r>
         <w:rPr/>
-        <w:t>Numbers in this document (1,606 backend tests, 305 frontend tests, 24 E2E test cases across 12 spec files) are a snapshot as of this writing and will drift as the codebase grows — re-run the counts (§1) rather than citing this document as the current figure without checking.</w:t>
+        <w:t>Numbers in this document (1,638 backend tests, 318 frontend tests, 24 E2E test cases across 12 spec files) are a snapshot as of this writing and will drift as the codebase grows — re-run the counts (§1) rather than citing this document as the current figure without checking.</w:t>
       </w:r>
     </w:p>
     <w:p>

</xml_diff>

<commit_message>
docs: bump backend test count to 1,640 (README + implementation report)
Two new tests landed with the deployment-log viewer feature. Swept every
count in both files rather than just the one this change touched, since
the earlier same-day digit fix (1,606 -> 1,638) had already missed one
spot in the implementation report's own opening paragraph.
</commit_message>
<xml_diff>
--- a/docs/framework/Apex-Implementation-Report.docx
+++ b/docs/framework/Apex-Implementation-Report.docx
@@ -70,7 +70,7 @@
           <w:b w:val="false"/>
           <w:i w:val="false"/>
         </w:rPr>
-        <w:t>Interview feedback on Apex's academic presentation asked for real engineering documentation — implementation, testing, and deployment — beyond the product-facing README. This document is that record. It describes Apex as of this writing: a split-stack web application with 1,638 backend tests (1,637 passing; one pre-existing, unrelated failure — see §5), 318 frontend unit tests, and 24 end-to-end Playwright test cases across 12 spec files.</w:t>
+        <w:t>Interview feedback on Apex's academic presentation asked for real engineering documentation — implementation, testing, and deployment — beyond the product-facing README. This document is that record. It describes Apex as of this writing: a split-stack web application with 1,640 backend tests (1,639 passing; one pre-existing, unrelated failure — see §5), 318 frontend unit tests, and 24 end-to-end Playwright test cases across 12 spec files.</w:t>
       </w:r>
     </w:p>
     <w:p>
@@ -507,7 +507,7 @@
           <w:b w:val="false"/>
           <w:i w:val="false"/>
         </w:rPr>
-        <w:t>1,638 tests as of this writing (python -m pytest tests/ -v --tb=short; 1,637 passing, one pre-existing failure unrelated to any work in this document — see §5), gated in CI before any Docker build is even attempted. Six autouse fixtures in tests/conftest.py remove entire categories of flaky-test risk by construction rather than by convention:</w:t>
+        <w:t>1,640 tests as of this writing (python -m pytest tests/ -v --tb=short; 1,639 passing, one pre-existing failure unrelated to any work in this document — see §5), gated in CI before any Docker build is even attempted. Six autouse fixtures in tests/conftest.py remove entire categories of flaky-test risk by construction rather than by convention:</w:t>
       </w:r>
     </w:p>
     <w:p>
@@ -897,7 +897,7 @@
       </w:pPr>
       <w:r>
         <w:rPr/>
-        <w:t>Numbers in this document (1,638 backend tests, 318 frontend tests, 24 E2E test cases across 12 spec files) are a snapshot as of this writing and will drift as the codebase grows — re-run the counts (§1) rather than citing this document as the current figure without checking.</w:t>
+        <w:t>Numbers in this document (1,640 backend tests, 318 frontend tests, 24 E2E test cases across 12 spec files) are a snapshot as of this writing and will drift as the codebase grows — re-run the counts (§1) rather than citing this document as the current figure without checking.</w:t>
       </w:r>
     </w:p>
     <w:p>

</xml_diff>

<commit_message>
docs(framework): log the maintenance-to-phase1 placement feature in §2.10
</commit_message>
<xml_diff>
--- a/docs/framework/Apex-Implementation-Report.docx
+++ b/docs/framework/Apex-Implementation-Report.docx
@@ -458,6 +458,20 @@
       <w:pPr/>
       <w:r>
         <w:t>deployment-log.md is an append-only audit trail Phase5Service has always written on every manual gate pass and every GitHub Actions dispatch/sync (found 2026-09-20, immediately after the story-context invalidation fix in S6.5 above), but it was never listed in the generic context-files response and had no viewer anywhere in the UI - it is a log, not an editable spec artefact, so it deliberately carries none of the lock, version or wiki-sync semantics the other context files do, and had simply been left off the Active Context surface as a result. Fixed by adding a dedicated read-only GET /api/workspace/deployment-log route and a "View Deployment Log" button in the Phase 5 header, opening a modal that renders the log as markdown with download and copy actions, matching the existing deploy pack viewer. 2 new backend tests; full backend suite 1639/1640 (the one known pre-existing unrelated failure), frontend typecheck/lint/vitest all clean.</w:t>
+      </w:r>
+    </w:p>
+    <w:p>
+      <w:pPr>
+        <w:pStyle w:val="Heading2"/>
+      </w:pPr>
+      <w:r>
+        <w:t>2.10 Maintenance to Phase 1 handoff: change requests defaulted to nothing, then to always-new-epic</w:t>
+      </w:r>
+    </w:p>
+    <w:p>
+      <w:pPr/>
+      <w:r>
+        <w:t>The change-request path in Maintenance triage - "Routed to discovery, a change request never gets patched directly" - ended in a dead "Open in Phase 1" link (found 2026-09-20): it navigated with router.push and no payload at all, so the request's own subject and description were dropped and the user landed on a blank Phase 1 with no idea why they were there. Separately, even a working handoff would have run into a real design gap: Phase 1 had no way to decide whether an incoming request belonged under an epic that already existed or needed a brand-new one - every fresh intake defaulted to "new epic." Fixed by adding a narrower sibling of the existing Requirement Gap Analysis feature: classify_change_request_placement() classifies exactly one incoming signal against the project's current epics (never inventing one outside that list) and proposes a placement - new epic, or a new story under a named existing one - with a rationale and a concrete story title/description, advisory only. Maintenance triage now stages this as an editable review (or a no-AI skip fallback so the flow never dead-ends if the AI call fails) before a confirmed "Continue to Phase 1" hands the reviewed placement to a small persisted intake store, which Phase 1 picks up on mount, shows as a dismissible banner, and clears. Nothing is created in Phase 1 without the human reviewing and confirming it there first, the same posture as every other AI-assisted step in the system. 12 new backend tests, 3 new frontend tests; full backend suite 1649/1650 (the one known pre-existing unrelated failure), frontend typecheck/lint/vitest all clean (321/321).</w:t>
       </w:r>
     </w:p>
     <w:p>

</xml_diff>

<commit_message>
docs(framework): log the Record Fix/Change relocation in §2.11
</commit_message>
<xml_diff>
--- a/docs/framework/Apex-Implementation-Report.docx
+++ b/docs/framework/Apex-Implementation-Report.docx
@@ -472,6 +472,20 @@
       <w:pPr/>
       <w:r>
         <w:t>The change-request path in Maintenance triage - "Routed to discovery, a change request never gets patched directly" - ended in a dead "Open in Phase 1" link (found 2026-09-20): it navigated with router.push and no payload at all, so the request's own subject and description were dropped and the user landed on a blank Phase 1 with no idea why they were there. Separately, even a working handoff would have run into a real design gap: Phase 1 had no way to decide whether an incoming request belonged under an epic that already existed or needed a brand-new one - every fresh intake defaulted to "new epic." Fixed by adding a narrower sibling of the existing Requirement Gap Analysis feature: classify_change_request_placement() classifies exactly one incoming signal against the project's current epics (never inventing one outside that list) and proposes a placement - new epic, or a new story under a named existing one - with a rationale and a concrete story title/description, advisory only. Maintenance triage now stages this as an editable review (or a no-AI skip fallback so the flow never dead-ends if the AI call fails) before a confirmed "Continue to Phase 1" hands the reviewed placement to a small persisted intake store, which Phase 1 picks up on mount, shows as a dismissible banner, and clears. Nothing is created in Phase 1 without the human reviewing and confirming it there first, the same posture as every other AI-assisted step in the system. 12 new backend tests, 3 new frontend tests; full backend suite 1649/1650 (the one known pre-existing unrelated failure), frontend typecheck/lint/vitest all clean (321/321).</w:t>
+      </w:r>
+    </w:p>
+    <w:p>
+      <w:pPr>
+        <w:pStyle w:val="Heading2"/>
+      </w:pPr>
+      <w:r>
+        <w:t>2.11 Resolve was bug-only and buried: change requests had no way to confirm progress</w:t>
+      </w:r>
+    </w:p>
+    <w:p>
+      <w:pPr/>
+      <w:r>
+        <w:t>The Resolve (record fix) button only ever appeared for classification == "bug", gated behind status != "resolved", and sat lower in the Maintenance detail panel disconnected from Delete (found 2026-09-20, right after the placement feature in S2.10 shipped). A change request routed to discovery had no way to confirm its progress once the Phase 1 work it produced actually shipped - the backend's resolve() was already generic enough to handle this (it falls back to the item's own subject and to "Resolved via Fix-Bolt." when no diagnosis or fix brief exists), the frontend simply never offered it for anything but a bug. Fixed by relocating the button into the header row next to Delete, gated only on the item having a classification at all, with a classification-aware label (Record Fix / Record Change), confirm text, and resolution_summary ("Resolved via Phase 1 discovery." for change requests, so the fix log stops claiming every resolution came via Fix-Bolt). Resolved items now show a compact badge in the same header spot instead of a separate callout further down. 1 new frontend test; full backend suite unaffected (1649/1650, the one known pre-existing unrelated failure), frontend typecheck/lint/vitest all clean (322/322).</w:t>
       </w:r>
     </w:p>
     <w:p>

</xml_diff>